<commit_message>
included integrity constraints to protect against account deletions with balances
</commit_message>
<xml_diff>
--- a/BankingDB_Final_Project_Report.docx
+++ b/BankingDB_Final_Project_Report.docx
@@ -9211,6 +9211,1082 @@
           <w:szCs w:val="17"/>
         </w:rPr>
         <w:t xml:space="preserve">Figure 4 — pgAdmin 4: Savings account annual interest projection (Q8) — 3 rows returned</w:t>
+      </w:r>
+    </w:p>
+    <w:p>
+      <w:r>
+        <w:br/>
+      </w:r>
+    </w:p>
+    <w:p>
+      <w:pPr>
+        <w:pStyle w:val="Heading2"/>
+        <w:spacing w:after="100" w:before="300"/>
+      </w:pPr>
+      <w:r>
+        <w:rPr>
+          <w:rFonts w:ascii="Arial" w:cs="Arial" w:eastAsia="Arial" w:hAnsi="Arial"/>
+          <w:b/>
+          <w:bCs/>
+          <w:color w:val="2E5FA3"/>
+          <w:sz w:val="27"/>
+          <w:szCs w:val="27"/>
+        </w:rPr>
+        <w:t xml:space="preserve">5.4 Integrity Constraints — Balance Protection Triggers</w:t>
+      </w:r>
+    </w:p>
+    <w:p>
+      <w:pPr>
+        <w:spacing w:after="80" w:before="60"/>
+      </w:pPr>
+      <w:r>
+        <w:rPr>
+          <w:rFonts w:ascii="Arial" w:cs="Arial" w:eastAsia="Arial" w:hAnsi="Arial"/>
+          <w:color w:val="000000"/>
+          <w:sz w:val="20"/>
+          <w:szCs w:val="20"/>
+        </w:rPr>
+        <w:t xml:space="preserve">Beyond standard SQL constraints (CHECK, NOT NULL, FOREIGN KEY), the schema implements six PostgreSQL BEFORE DELETE triggers that enforce a critical business rule: no account with an outstanding balance may be deleted, and no customer may be removed while any of their accounts carry a balance. These triggers fire at the database level, making the protection independent of the application layer.</w:t>
+      </w:r>
+    </w:p>
+    <w:p>
+      <w:pPr>
+        <w:spacing w:after="80" w:before="80"/>
+      </w:pPr>
+    </w:p>
+    <w:tbl>
+      <w:tblPr>
+        <w:tblW w:type="dxa" w:w="9360"/>
+        <w:tblBorders>
+          <w:top w:val="single" w:color="auto" w:sz="4"/>
+          <w:left w:val="single" w:color="auto" w:sz="4"/>
+          <w:bottom w:val="single" w:color="auto" w:sz="4"/>
+          <w:right w:val="single" w:color="auto" w:sz="4"/>
+          <w:insideH w:val="single" w:color="auto" w:sz="4"/>
+          <w:insideV w:val="single" w:color="auto" w:sz="4"/>
+        </w:tblBorders>
+      </w:tblPr>
+      <w:tblGrid>
+        <w:gridCol w:w="3000"/>
+        <w:gridCol w:w="2200"/>
+        <w:gridCol w:w="4160"/>
+      </w:tblGrid>
+      <w:tr>
+        <w:trPr>
+          <w:tblHeader/>
+        </w:trPr>
+        <w:tc>
+          <w:tcPr>
+            <w:tcW w:type="dxa" w:w="3000"/>
+            <w:tcBorders>
+              <w:top w:val="single" w:color="1F3864" w:sz="4"/>
+              <w:left w:val="single" w:color="1F3864" w:sz="4"/>
+              <w:bottom w:val="single" w:color="1F3864" w:sz="4"/>
+              <w:right w:val="single" w:color="1F3864" w:sz="4"/>
+            </w:tcBorders>
+            <w:shd w:fill="1F3864" w:val="clear"/>
+            <w:tcMar>
+              <w:top w:type="dxa" w:w="80"/>
+              <w:left w:type="dxa" w:w="120"/>
+              <w:bottom w:type="dxa" w:w="80"/>
+              <w:right w:type="dxa" w:w="120"/>
+            </w:tcMar>
+          </w:tcPr>
+          <w:p>
+            <w:r>
+              <w:rPr>
+                <w:rFonts w:ascii="Arial" w:cs="Arial" w:eastAsia="Arial" w:hAnsi="Arial"/>
+                <w:b/>
+                <w:bCs/>
+                <w:color w:val="FFFFFF"/>
+                <w:sz w:val="18"/>
+                <w:szCs w:val="18"/>
+              </w:rPr>
+              <w:t xml:space="preserve">Trigger</w:t>
+            </w:r>
+          </w:p>
+        </w:tc>
+        <w:tc>
+          <w:tcPr>
+            <w:tcW w:type="dxa" w:w="2200"/>
+            <w:tcBorders>
+              <w:top w:val="single" w:color="1F3864" w:sz="4"/>
+              <w:left w:val="single" w:color="1F3864" w:sz="4"/>
+              <w:bottom w:val="single" w:color="1F3864" w:sz="4"/>
+              <w:right w:val="single" w:color="1F3864" w:sz="4"/>
+            </w:tcBorders>
+            <w:shd w:fill="1F3864" w:val="clear"/>
+            <w:tcMar>
+              <w:top w:type="dxa" w:w="80"/>
+              <w:left w:type="dxa" w:w="120"/>
+              <w:bottom w:type="dxa" w:w="80"/>
+              <w:right w:type="dxa" w:w="120"/>
+            </w:tcMar>
+          </w:tcPr>
+          <w:p>
+            <w:r>
+              <w:rPr>
+                <w:rFonts w:ascii="Arial" w:cs="Arial" w:eastAsia="Arial" w:hAnsi="Arial"/>
+                <w:b/>
+                <w:bCs/>
+                <w:color w:val="FFFFFF"/>
+                <w:sz w:val="18"/>
+                <w:szCs w:val="18"/>
+              </w:rPr>
+              <w:t xml:space="preserve">Table</w:t>
+            </w:r>
+          </w:p>
+        </w:tc>
+        <w:tc>
+          <w:tcPr>
+            <w:tcW w:type="dxa" w:w="4160"/>
+            <w:tcBorders>
+              <w:top w:val="single" w:color="1F3864" w:sz="4"/>
+              <w:left w:val="single" w:color="1F3864" w:sz="4"/>
+              <w:bottom w:val="single" w:color="1F3864" w:sz="4"/>
+              <w:right w:val="single" w:color="1F3864" w:sz="4"/>
+            </w:tcBorders>
+            <w:shd w:fill="1F3864" w:val="clear"/>
+            <w:tcMar>
+              <w:top w:type="dxa" w:w="80"/>
+              <w:left w:type="dxa" w:w="120"/>
+              <w:bottom w:type="dxa" w:w="80"/>
+              <w:right w:type="dxa" w:w="120"/>
+            </w:tcMar>
+          </w:tcPr>
+          <w:p>
+            <w:r>
+              <w:rPr>
+                <w:rFonts w:ascii="Arial" w:cs="Arial" w:eastAsia="Arial" w:hAnsi="Arial"/>
+                <w:b/>
+                <w:bCs/>
+                <w:color w:val="FFFFFF"/>
+                <w:sz w:val="18"/>
+                <w:szCs w:val="18"/>
+              </w:rPr>
+              <w:t xml:space="preserve">Protection</w:t>
+            </w:r>
+          </w:p>
+        </w:tc>
+      </w:tr>
+      <w:tr>
+        <w:tc>
+          <w:tcPr>
+            <w:tcW w:type="dxa" w:w="3000"/>
+            <w:tcBorders>
+              <w:top w:val="single" w:color="AAAAAA" w:sz="4"/>
+              <w:left w:val="single" w:color="AAAAAA" w:sz="4"/>
+              <w:bottom w:val="single" w:color="AAAAAA" w:sz="4"/>
+              <w:right w:val="single" w:color="AAAAAA" w:sz="4"/>
+            </w:tcBorders>
+            <w:shd w:fill="EBF3FF" w:val="clear"/>
+            <w:tcMar>
+              <w:top w:type="dxa" w:w="70"/>
+              <w:left w:type="dxa" w:w="120"/>
+              <w:bottom w:type="dxa" w:w="70"/>
+              <w:right w:type="dxa" w:w="120"/>
+            </w:tcMar>
+          </w:tcPr>
+          <w:p>
+            <w:r>
+              <w:rPr>
+                <w:rFonts w:ascii="Arial" w:cs="Arial" w:eastAsia="Arial" w:hAnsi="Arial"/>
+                <w:b w:val="false"/>
+                <w:bCs w:val="false"/>
+                <w:sz w:val="18"/>
+                <w:szCs w:val="18"/>
+              </w:rPr>
+              <w:t xml:space="preserve">trg_prevent_savings_deletion</w:t>
+            </w:r>
+          </w:p>
+        </w:tc>
+        <w:tc>
+          <w:tcPr>
+            <w:tcW w:type="dxa" w:w="2200"/>
+            <w:tcBorders>
+              <w:top w:val="single" w:color="AAAAAA" w:sz="4"/>
+              <w:left w:val="single" w:color="AAAAAA" w:sz="4"/>
+              <w:bottom w:val="single" w:color="AAAAAA" w:sz="4"/>
+              <w:right w:val="single" w:color="AAAAAA" w:sz="4"/>
+            </w:tcBorders>
+            <w:shd w:fill="EBF3FF" w:val="clear"/>
+            <w:tcMar>
+              <w:top w:type="dxa" w:w="70"/>
+              <w:left w:type="dxa" w:w="120"/>
+              <w:bottom w:type="dxa" w:w="70"/>
+              <w:right w:type="dxa" w:w="120"/>
+            </w:tcMar>
+          </w:tcPr>
+          <w:p>
+            <w:r>
+              <w:rPr>
+                <w:rFonts w:ascii="Arial" w:cs="Arial" w:eastAsia="Arial" w:hAnsi="Arial"/>
+                <w:b w:val="false"/>
+                <w:bCs w:val="false"/>
+                <w:sz w:val="18"/>
+                <w:szCs w:val="18"/>
+              </w:rPr>
+              <w:t xml:space="preserve">Savings_Account</w:t>
+            </w:r>
+          </w:p>
+        </w:tc>
+        <w:tc>
+          <w:tcPr>
+            <w:tcW w:type="dxa" w:w="4160"/>
+            <w:tcBorders>
+              <w:top w:val="single" w:color="AAAAAA" w:sz="4"/>
+              <w:left w:val="single" w:color="AAAAAA" w:sz="4"/>
+              <w:bottom w:val="single" w:color="AAAAAA" w:sz="4"/>
+              <w:right w:val="single" w:color="AAAAAA" w:sz="4"/>
+            </w:tcBorders>
+            <w:shd w:fill="EBF3FF" w:val="clear"/>
+            <w:tcMar>
+              <w:top w:type="dxa" w:w="70"/>
+              <w:left w:type="dxa" w:w="120"/>
+              <w:bottom w:type="dxa" w:w="70"/>
+              <w:right w:type="dxa" w:w="120"/>
+            </w:tcMar>
+          </w:tcPr>
+          <w:p>
+            <w:r>
+              <w:rPr>
+                <w:rFonts w:ascii="Arial" w:cs="Arial" w:eastAsia="Arial" w:hAnsi="Arial"/>
+                <w:b w:val="false"/>
+                <w:bCs w:val="false"/>
+                <w:sz w:val="18"/>
+                <w:szCs w:val="18"/>
+              </w:rPr>
+              <w:t xml:space="preserve">Blocks deletion if Account.balance &gt; 0</w:t>
+            </w:r>
+          </w:p>
+        </w:tc>
+      </w:tr>
+      <w:tr>
+        <w:tc>
+          <w:tcPr>
+            <w:tcW w:type="dxa" w:w="3000"/>
+            <w:tcBorders>
+              <w:top w:val="single" w:color="AAAAAA" w:sz="4"/>
+              <w:left w:val="single" w:color="AAAAAA" w:sz="4"/>
+              <w:bottom w:val="single" w:color="AAAAAA" w:sz="4"/>
+              <w:right w:val="single" w:color="AAAAAA" w:sz="4"/>
+            </w:tcBorders>
+            <w:shd w:fill="FFFFFF" w:val="clear"/>
+            <w:tcMar>
+              <w:top w:type="dxa" w:w="70"/>
+              <w:left w:type="dxa" w:w="120"/>
+              <w:bottom w:type="dxa" w:w="70"/>
+              <w:right w:type="dxa" w:w="120"/>
+            </w:tcMar>
+          </w:tcPr>
+          <w:p>
+            <w:r>
+              <w:rPr>
+                <w:rFonts w:ascii="Arial" w:cs="Arial" w:eastAsia="Arial" w:hAnsi="Arial"/>
+                <w:b w:val="false"/>
+                <w:bCs w:val="false"/>
+                <w:sz w:val="18"/>
+                <w:szCs w:val="18"/>
+              </w:rPr>
+              <w:t xml:space="preserve">trg_prevent_checking_deletion</w:t>
+            </w:r>
+          </w:p>
+        </w:tc>
+        <w:tc>
+          <w:tcPr>
+            <w:tcW w:type="dxa" w:w="2200"/>
+            <w:tcBorders>
+              <w:top w:val="single" w:color="AAAAAA" w:sz="4"/>
+              <w:left w:val="single" w:color="AAAAAA" w:sz="4"/>
+              <w:bottom w:val="single" w:color="AAAAAA" w:sz="4"/>
+              <w:right w:val="single" w:color="AAAAAA" w:sz="4"/>
+            </w:tcBorders>
+            <w:shd w:fill="FFFFFF" w:val="clear"/>
+            <w:tcMar>
+              <w:top w:type="dxa" w:w="70"/>
+              <w:left w:type="dxa" w:w="120"/>
+              <w:bottom w:type="dxa" w:w="70"/>
+              <w:right w:type="dxa" w:w="120"/>
+            </w:tcMar>
+          </w:tcPr>
+          <w:p>
+            <w:r>
+              <w:rPr>
+                <w:rFonts w:ascii="Arial" w:cs="Arial" w:eastAsia="Arial" w:hAnsi="Arial"/>
+                <w:b w:val="false"/>
+                <w:bCs w:val="false"/>
+                <w:sz w:val="18"/>
+                <w:szCs w:val="18"/>
+              </w:rPr>
+              <w:t xml:space="preserve">Checking_Account</w:t>
+            </w:r>
+          </w:p>
+        </w:tc>
+        <w:tc>
+          <w:tcPr>
+            <w:tcW w:type="dxa" w:w="4160"/>
+            <w:tcBorders>
+              <w:top w:val="single" w:color="AAAAAA" w:sz="4"/>
+              <w:left w:val="single" w:color="AAAAAA" w:sz="4"/>
+              <w:bottom w:val="single" w:color="AAAAAA" w:sz="4"/>
+              <w:right w:val="single" w:color="AAAAAA" w:sz="4"/>
+            </w:tcBorders>
+            <w:shd w:fill="FFFFFF" w:val="clear"/>
+            <w:tcMar>
+              <w:top w:type="dxa" w:w="70"/>
+              <w:left w:type="dxa" w:w="120"/>
+              <w:bottom w:type="dxa" w:w="70"/>
+              <w:right w:type="dxa" w:w="120"/>
+            </w:tcMar>
+          </w:tcPr>
+          <w:p>
+            <w:r>
+              <w:rPr>
+                <w:rFonts w:ascii="Arial" w:cs="Arial" w:eastAsia="Arial" w:hAnsi="Arial"/>
+                <w:b w:val="false"/>
+                <w:bCs w:val="false"/>
+                <w:sz w:val="18"/>
+                <w:szCs w:val="18"/>
+              </w:rPr>
+              <w:t xml:space="preserve">Blocks deletion if Account.balance &gt; 0</w:t>
+            </w:r>
+          </w:p>
+        </w:tc>
+      </w:tr>
+      <w:tr>
+        <w:tc>
+          <w:tcPr>
+            <w:tcW w:type="dxa" w:w="3000"/>
+            <w:tcBorders>
+              <w:top w:val="single" w:color="AAAAAA" w:sz="4"/>
+              <w:left w:val="single" w:color="AAAAAA" w:sz="4"/>
+              <w:bottom w:val="single" w:color="AAAAAA" w:sz="4"/>
+              <w:right w:val="single" w:color="AAAAAA" w:sz="4"/>
+            </w:tcBorders>
+            <w:shd w:fill="EBF3FF" w:val="clear"/>
+            <w:tcMar>
+              <w:top w:type="dxa" w:w="70"/>
+              <w:left w:type="dxa" w:w="120"/>
+              <w:bottom w:type="dxa" w:w="70"/>
+              <w:right w:type="dxa" w:w="120"/>
+            </w:tcMar>
+          </w:tcPr>
+          <w:p>
+            <w:r>
+              <w:rPr>
+                <w:rFonts w:ascii="Arial" w:cs="Arial" w:eastAsia="Arial" w:hAnsi="Arial"/>
+                <w:b w:val="false"/>
+                <w:bCs w:val="false"/>
+                <w:sz w:val="18"/>
+                <w:szCs w:val="18"/>
+              </w:rPr>
+              <w:t xml:space="preserve">trg_prevent_mm_deletion</w:t>
+            </w:r>
+          </w:p>
+        </w:tc>
+        <w:tc>
+          <w:tcPr>
+            <w:tcW w:type="dxa" w:w="2200"/>
+            <w:tcBorders>
+              <w:top w:val="single" w:color="AAAAAA" w:sz="4"/>
+              <w:left w:val="single" w:color="AAAAAA" w:sz="4"/>
+              <w:bottom w:val="single" w:color="AAAAAA" w:sz="4"/>
+              <w:right w:val="single" w:color="AAAAAA" w:sz="4"/>
+            </w:tcBorders>
+            <w:shd w:fill="EBF3FF" w:val="clear"/>
+            <w:tcMar>
+              <w:top w:type="dxa" w:w="70"/>
+              <w:left w:type="dxa" w:w="120"/>
+              <w:bottom w:type="dxa" w:w="70"/>
+              <w:right w:type="dxa" w:w="120"/>
+            </w:tcMar>
+          </w:tcPr>
+          <w:p>
+            <w:r>
+              <w:rPr>
+                <w:rFonts w:ascii="Arial" w:cs="Arial" w:eastAsia="Arial" w:hAnsi="Arial"/>
+                <w:b w:val="false"/>
+                <w:bCs w:val="false"/>
+                <w:sz w:val="18"/>
+                <w:szCs w:val="18"/>
+              </w:rPr>
+              <w:t xml:space="preserve">MoneyMarket_Account</w:t>
+            </w:r>
+          </w:p>
+        </w:tc>
+        <w:tc>
+          <w:tcPr>
+            <w:tcW w:type="dxa" w:w="4160"/>
+            <w:tcBorders>
+              <w:top w:val="single" w:color="AAAAAA" w:sz="4"/>
+              <w:left w:val="single" w:color="AAAAAA" w:sz="4"/>
+              <w:bottom w:val="single" w:color="AAAAAA" w:sz="4"/>
+              <w:right w:val="single" w:color="AAAAAA" w:sz="4"/>
+            </w:tcBorders>
+            <w:shd w:fill="EBF3FF" w:val="clear"/>
+            <w:tcMar>
+              <w:top w:type="dxa" w:w="70"/>
+              <w:left w:type="dxa" w:w="120"/>
+              <w:bottom w:type="dxa" w:w="70"/>
+              <w:right w:type="dxa" w:w="120"/>
+            </w:tcMar>
+          </w:tcPr>
+          <w:p>
+            <w:r>
+              <w:rPr>
+                <w:rFonts w:ascii="Arial" w:cs="Arial" w:eastAsia="Arial" w:hAnsi="Arial"/>
+                <w:b w:val="false"/>
+                <w:bCs w:val="false"/>
+                <w:sz w:val="18"/>
+                <w:szCs w:val="18"/>
+              </w:rPr>
+              <w:t xml:space="preserve">Blocks deletion if Account.balance &gt; 0</w:t>
+            </w:r>
+          </w:p>
+        </w:tc>
+      </w:tr>
+      <w:tr>
+        <w:tc>
+          <w:tcPr>
+            <w:tcW w:type="dxa" w:w="3000"/>
+            <w:tcBorders>
+              <w:top w:val="single" w:color="AAAAAA" w:sz="4"/>
+              <w:left w:val="single" w:color="AAAAAA" w:sz="4"/>
+              <w:bottom w:val="single" w:color="AAAAAA" w:sz="4"/>
+              <w:right w:val="single" w:color="AAAAAA" w:sz="4"/>
+            </w:tcBorders>
+            <w:shd w:fill="FFFFFF" w:val="clear"/>
+            <w:tcMar>
+              <w:top w:type="dxa" w:w="70"/>
+              <w:left w:type="dxa" w:w="120"/>
+              <w:bottom w:type="dxa" w:w="70"/>
+              <w:right w:type="dxa" w:w="120"/>
+            </w:tcMar>
+          </w:tcPr>
+          <w:p>
+            <w:r>
+              <w:rPr>
+                <w:rFonts w:ascii="Arial" w:cs="Arial" w:eastAsia="Arial" w:hAnsi="Arial"/>
+                <w:b w:val="false"/>
+                <w:bCs w:val="false"/>
+                <w:sz w:val="18"/>
+                <w:szCs w:val="18"/>
+              </w:rPr>
+              <w:t xml:space="preserve">trg_prevent_loan_deletion</w:t>
+            </w:r>
+          </w:p>
+        </w:tc>
+        <w:tc>
+          <w:tcPr>
+            <w:tcW w:type="dxa" w:w="2200"/>
+            <w:tcBorders>
+              <w:top w:val="single" w:color="AAAAAA" w:sz="4"/>
+              <w:left w:val="single" w:color="AAAAAA" w:sz="4"/>
+              <w:bottom w:val="single" w:color="AAAAAA" w:sz="4"/>
+              <w:right w:val="single" w:color="AAAAAA" w:sz="4"/>
+            </w:tcBorders>
+            <w:shd w:fill="FFFFFF" w:val="clear"/>
+            <w:tcMar>
+              <w:top w:type="dxa" w:w="70"/>
+              <w:left w:type="dxa" w:w="120"/>
+              <w:bottom w:type="dxa" w:w="70"/>
+              <w:right w:type="dxa" w:w="120"/>
+            </w:tcMar>
+          </w:tcPr>
+          <w:p>
+            <w:r>
+              <w:rPr>
+                <w:rFonts w:ascii="Arial" w:cs="Arial" w:eastAsia="Arial" w:hAnsi="Arial"/>
+                <w:b w:val="false"/>
+                <w:bCs w:val="false"/>
+                <w:sz w:val="18"/>
+                <w:szCs w:val="18"/>
+              </w:rPr>
+              <w:t xml:space="preserve">Loan_Account</w:t>
+            </w:r>
+          </w:p>
+        </w:tc>
+        <w:tc>
+          <w:tcPr>
+            <w:tcW w:type="dxa" w:w="4160"/>
+            <w:tcBorders>
+              <w:top w:val="single" w:color="AAAAAA" w:sz="4"/>
+              <w:left w:val="single" w:color="AAAAAA" w:sz="4"/>
+              <w:bottom w:val="single" w:color="AAAAAA" w:sz="4"/>
+              <w:right w:val="single" w:color="AAAAAA" w:sz="4"/>
+            </w:tcBorders>
+            <w:shd w:fill="FFFFFF" w:val="clear"/>
+            <w:tcMar>
+              <w:top w:type="dxa" w:w="70"/>
+              <w:left w:type="dxa" w:w="120"/>
+              <w:bottom w:type="dxa" w:w="70"/>
+              <w:right w:type="dxa" w:w="120"/>
+            </w:tcMar>
+          </w:tcPr>
+          <w:p>
+            <w:r>
+              <w:rPr>
+                <w:rFonts w:ascii="Arial" w:cs="Arial" w:eastAsia="Arial" w:hAnsi="Arial"/>
+                <w:b w:val="false"/>
+                <w:bCs w:val="false"/>
+                <w:sz w:val="18"/>
+                <w:szCs w:val="18"/>
+              </w:rPr>
+              <w:t xml:space="preserve">Blocks deletion if Account.balance &gt; 0</w:t>
+            </w:r>
+          </w:p>
+        </w:tc>
+      </w:tr>
+      <w:tr>
+        <w:tc>
+          <w:tcPr>
+            <w:tcW w:type="dxa" w:w="3000"/>
+            <w:tcBorders>
+              <w:top w:val="single" w:color="AAAAAA" w:sz="4"/>
+              <w:left w:val="single" w:color="AAAAAA" w:sz="4"/>
+              <w:bottom w:val="single" w:color="AAAAAA" w:sz="4"/>
+              <w:right w:val="single" w:color="AAAAAA" w:sz="4"/>
+            </w:tcBorders>
+            <w:shd w:fill="EBF3FF" w:val="clear"/>
+            <w:tcMar>
+              <w:top w:type="dxa" w:w="70"/>
+              <w:left w:type="dxa" w:w="120"/>
+              <w:bottom w:type="dxa" w:w="70"/>
+              <w:right w:type="dxa" w:w="120"/>
+            </w:tcMar>
+          </w:tcPr>
+          <w:p>
+            <w:r>
+              <w:rPr>
+                <w:rFonts w:ascii="Arial" w:cs="Arial" w:eastAsia="Arial" w:hAnsi="Arial"/>
+                <w:b w:val="false"/>
+                <w:bCs w:val="false"/>
+                <w:sz w:val="18"/>
+                <w:szCs w:val="18"/>
+              </w:rPr>
+              <w:t xml:space="preserve">trg_prevent_account_deletion</w:t>
+            </w:r>
+          </w:p>
+        </w:tc>
+        <w:tc>
+          <w:tcPr>
+            <w:tcW w:type="dxa" w:w="2200"/>
+            <w:tcBorders>
+              <w:top w:val="single" w:color="AAAAAA" w:sz="4"/>
+              <w:left w:val="single" w:color="AAAAAA" w:sz="4"/>
+              <w:bottom w:val="single" w:color="AAAAAA" w:sz="4"/>
+              <w:right w:val="single" w:color="AAAAAA" w:sz="4"/>
+            </w:tcBorders>
+            <w:shd w:fill="EBF3FF" w:val="clear"/>
+            <w:tcMar>
+              <w:top w:type="dxa" w:w="70"/>
+              <w:left w:type="dxa" w:w="120"/>
+              <w:bottom w:type="dxa" w:w="70"/>
+              <w:right w:type="dxa" w:w="120"/>
+            </w:tcMar>
+          </w:tcPr>
+          <w:p>
+            <w:r>
+              <w:rPr>
+                <w:rFonts w:ascii="Arial" w:cs="Arial" w:eastAsia="Arial" w:hAnsi="Arial"/>
+                <w:b w:val="false"/>
+                <w:bCs w:val="false"/>
+                <w:sz w:val="18"/>
+                <w:szCs w:val="18"/>
+              </w:rPr>
+              <w:t xml:space="preserve">Account</w:t>
+            </w:r>
+          </w:p>
+        </w:tc>
+        <w:tc>
+          <w:tcPr>
+            <w:tcW w:type="dxa" w:w="4160"/>
+            <w:tcBorders>
+              <w:top w:val="single" w:color="AAAAAA" w:sz="4"/>
+              <w:left w:val="single" w:color="AAAAAA" w:sz="4"/>
+              <w:bottom w:val="single" w:color="AAAAAA" w:sz="4"/>
+              <w:right w:val="single" w:color="AAAAAA" w:sz="4"/>
+            </w:tcBorders>
+            <w:shd w:fill="EBF3FF" w:val="clear"/>
+            <w:tcMar>
+              <w:top w:type="dxa" w:w="70"/>
+              <w:left w:type="dxa" w:w="120"/>
+              <w:bottom w:type="dxa" w:w="70"/>
+              <w:right w:type="dxa" w:w="120"/>
+            </w:tcMar>
+          </w:tcPr>
+          <w:p>
+            <w:r>
+              <w:rPr>
+                <w:rFonts w:ascii="Arial" w:cs="Arial" w:eastAsia="Arial" w:hAnsi="Arial"/>
+                <w:b w:val="false"/>
+                <w:bCs w:val="false"/>
+                <w:sz w:val="18"/>
+                <w:szCs w:val="18"/>
+              </w:rPr>
+              <w:t xml:space="preserve">Blocks deletion of any account type with balance &gt; 0 (catches supertype-level deletes)</w:t>
+            </w:r>
+          </w:p>
+        </w:tc>
+      </w:tr>
+      <w:tr>
+        <w:tc>
+          <w:tcPr>
+            <w:tcW w:type="dxa" w:w="3000"/>
+            <w:tcBorders>
+              <w:top w:val="single" w:color="AAAAAA" w:sz="4"/>
+              <w:left w:val="single" w:color="AAAAAA" w:sz="4"/>
+              <w:bottom w:val="single" w:color="AAAAAA" w:sz="4"/>
+              <w:right w:val="single" w:color="AAAAAA" w:sz="4"/>
+            </w:tcBorders>
+            <w:shd w:fill="FFFFFF" w:val="clear"/>
+            <w:tcMar>
+              <w:top w:type="dxa" w:w="70"/>
+              <w:left w:type="dxa" w:w="120"/>
+              <w:bottom w:type="dxa" w:w="70"/>
+              <w:right w:type="dxa" w:w="120"/>
+            </w:tcMar>
+          </w:tcPr>
+          <w:p>
+            <w:r>
+              <w:rPr>
+                <w:rFonts w:ascii="Arial" w:cs="Arial" w:eastAsia="Arial" w:hAnsi="Arial"/>
+                <w:b w:val="false"/>
+                <w:bCs w:val="false"/>
+                <w:sz w:val="18"/>
+                <w:szCs w:val="18"/>
+              </w:rPr>
+              <w:t xml:space="preserve">trg_prevent_customer_deletion</w:t>
+            </w:r>
+          </w:p>
+        </w:tc>
+        <w:tc>
+          <w:tcPr>
+            <w:tcW w:type="dxa" w:w="2200"/>
+            <w:tcBorders>
+              <w:top w:val="single" w:color="AAAAAA" w:sz="4"/>
+              <w:left w:val="single" w:color="AAAAAA" w:sz="4"/>
+              <w:bottom w:val="single" w:color="AAAAAA" w:sz="4"/>
+              <w:right w:val="single" w:color="AAAAAA" w:sz="4"/>
+            </w:tcBorders>
+            <w:shd w:fill="FFFFFF" w:val="clear"/>
+            <w:tcMar>
+              <w:top w:type="dxa" w:w="70"/>
+              <w:left w:type="dxa" w:w="120"/>
+              <w:bottom w:type="dxa" w:w="70"/>
+              <w:right w:type="dxa" w:w="120"/>
+            </w:tcMar>
+          </w:tcPr>
+          <w:p>
+            <w:r>
+              <w:rPr>
+                <w:rFonts w:ascii="Arial" w:cs="Arial" w:eastAsia="Arial" w:hAnsi="Arial"/>
+                <w:b w:val="false"/>
+                <w:bCs w:val="false"/>
+                <w:sz w:val="18"/>
+                <w:szCs w:val="18"/>
+              </w:rPr>
+              <w:t xml:space="preserve">Customer</w:t>
+            </w:r>
+          </w:p>
+        </w:tc>
+        <w:tc>
+          <w:tcPr>
+            <w:tcW w:type="dxa" w:w="4160"/>
+            <w:tcBorders>
+              <w:top w:val="single" w:color="AAAAAA" w:sz="4"/>
+              <w:left w:val="single" w:color="AAAAAA" w:sz="4"/>
+              <w:bottom w:val="single" w:color="AAAAAA" w:sz="4"/>
+              <w:right w:val="single" w:color="AAAAAA" w:sz="4"/>
+            </w:tcBorders>
+            <w:shd w:fill="FFFFFF" w:val="clear"/>
+            <w:tcMar>
+              <w:top w:type="dxa" w:w="70"/>
+              <w:left w:type="dxa" w:w="120"/>
+              <w:bottom w:type="dxa" w:w="70"/>
+              <w:right w:type="dxa" w:w="120"/>
+            </w:tcMar>
+          </w:tcPr>
+          <w:p>
+            <w:r>
+              <w:rPr>
+                <w:rFonts w:ascii="Arial" w:cs="Arial" w:eastAsia="Arial" w:hAnsi="Arial"/>
+                <w:b w:val="false"/>
+                <w:bCs w:val="false"/>
+                <w:sz w:val="18"/>
+                <w:szCs w:val="18"/>
+              </w:rPr>
+              <w:t xml:space="preserve">Loops through all linked accounts; blocks deletion if any has balance &gt; 0</w:t>
+            </w:r>
+          </w:p>
+        </w:tc>
+      </w:tr>
+    </w:tbl>
+    <w:p>
+      <w:pPr>
+        <w:spacing w:after="80" w:before="80"/>
+      </w:pPr>
+    </w:p>
+    <w:p>
+      <w:pPr>
+        <w:spacing w:after="80" w:before="60"/>
+      </w:pPr>
+      <w:r>
+        <w:rPr>
+          <w:rFonts w:ascii="Arial" w:cs="Arial" w:eastAsia="Arial" w:hAnsi="Arial"/>
+          <w:color w:val="000000"/>
+          <w:sz w:val="20"/>
+          <w:szCs w:val="20"/>
+        </w:rPr>
+        <w:t xml:space="preserve">Two trigger functions are used. prevent_subtype_deletion_with_balance() is shared across all four subtype tables — it joins up to the Account supertype to retrieve the balance and account type, then raises a descriptive exception. prevent_account_deletion_with_balance() fires on the Account table itself to catch cascade-triggered deletes. A third function, prevent_customer_deletion_with_balance(), iterates over all accounts linked to the customer via Customer_Account and blocks the delete if any account carries a non-zero balance.</w:t>
+      </w:r>
+    </w:p>
+    <w:p>
+      <w:pPr>
+        <w:spacing w:after="80" w:before="80"/>
+      </w:pPr>
+    </w:p>
+    <w:p>
+      <w:pPr>
+        <w:pStyle w:val="Heading3"/>
+        <w:spacing w:after="60" w:before="220"/>
+      </w:pPr>
+      <w:r>
+        <w:rPr>
+          <w:rFonts w:ascii="Arial" w:cs="Arial" w:eastAsia="Arial" w:hAnsi="Arial"/>
+          <w:b/>
+          <w:bCs/>
+          <w:color w:val="404040"/>
+          <w:sz w:val="22"/>
+          <w:szCs w:val="22"/>
+        </w:rPr>
+        <w:t xml:space="preserve">Integrity Verification — Live pgAdmin Screenshots</w:t>
+      </w:r>
+    </w:p>
+    <w:p>
+      <w:pPr>
+        <w:spacing w:after="80" w:before="60"/>
+      </w:pPr>
+      <w:r>
+        <w:rPr>
+          <w:rFonts w:ascii="Arial" w:cs="Arial" w:eastAsia="Arial" w:hAnsi="Arial"/>
+          <w:color w:val="000000"/>
+          <w:sz w:val="20"/>
+          <w:szCs w:val="20"/>
+        </w:rPr>
+        <w:t xml:space="preserve">The following screenshots confirm the triggers are active and firing correctly against the live database. Each shows a DELETE statement attempted in pgAdmin and the resulting error raised by the trigger function.</w:t>
+      </w:r>
+    </w:p>
+    <w:p>
+      <w:pPr>
+        <w:spacing w:after="80" w:before="80"/>
+      </w:pPr>
+    </w:p>
+    <w:p>
+      <w:pPr>
+        <w:pStyle w:val="Heading4"/>
+        <w:spacing w:after="40" w:before="160"/>
+      </w:pPr>
+      <w:r>
+        <w:rPr>
+          <w:rFonts w:ascii="Arial" w:cs="Arial" w:eastAsia="Arial" w:hAnsi="Arial"/>
+          <w:b/>
+          <w:bCs/>
+          <w:color w:val="1F3864"/>
+          <w:sz w:val="20"/>
+          <w:szCs w:val="20"/>
+        </w:rPr>
+        <w:t xml:space="preserve">Figure 5 — Attempt to delete Checking Account #5 ($3,100.00 balance)</w:t>
+      </w:r>
+    </w:p>
+    <w:p>
+      <w:pPr>
+        <w:spacing w:after="80" w:before="60"/>
+      </w:pPr>
+      <w:r>
+        <w:rPr>
+          <w:rFonts w:ascii="Arial" w:cs="Arial" w:eastAsia="Arial" w:hAnsi="Arial"/>
+          <w:color w:val="000000"/>
+          <w:sz w:val="20"/>
+          <w:szCs w:val="20"/>
+        </w:rPr>
+        <w:t xml:space="preserve">DELETE FROM account WHERE account_no = 5 is blocked by the trg_prevent_account_deletion trigger on the Account supertype table. The error message identifies the account number, type, and outstanding balance.</w:t>
+      </w:r>
+    </w:p>
+    <w:p>
+      <w:pPr>
+        <w:spacing w:after="80" w:before="80"/>
+      </w:pPr>
+    </w:p>
+    <w:p>
+      <w:pPr>
+        <w:spacing w:after="40" w:before="80"/>
+        <w:jc w:val="center"/>
+      </w:pPr>
+      <w:r>
+        <w:drawing>
+          <wp:inline distT="0" distB="0" distL="0" distR="0">
+            <wp:extent cx="5619750" cy="2790825"/>
+            <wp:effectExtent t="0" r="0" b="0" l="0"/>
+            <wp:docPr id="1" name="" descr="" title=""/>
+            <wp:cNvGraphicFramePr>
+              <a:graphicFrameLocks xmlns:a="http://schemas.openxmlformats.org/drawingml/2006/main" noChangeAspect="1"/>
+            </wp:cNvGraphicFramePr>
+            <a:graphic xmlns:a="http://schemas.openxmlformats.org/drawingml/2006/main">
+              <a:graphicData uri="http://schemas.openxmlformats.org/drawingml/2006/picture">
+                <pic:pic xmlns:pic="http://schemas.openxmlformats.org/drawingml/2006/picture">
+                  <pic:nvPicPr>
+                    <pic:cNvPr id="0" name="" descr=""/>
+                    <pic:cNvPicPr>
+                      <a:picLocks noChangeAspect="1" noChangeArrowheads="1"/>
+                    </pic:cNvPicPr>
+                  </pic:nvPicPr>
+                  <pic:blipFill>
+                    <a:blip r:embed="rId13" cstate="none"/>
+                    <a:srcRect/>
+                    <a:stretch>
+                      <a:fillRect/>
+                    </a:stretch>
+                  </pic:blipFill>
+                  <pic:spPr bwMode="auto">
+                    <a:xfrm>
+                      <a:off x="0" y="0"/>
+                      <a:ext cx="5619750" cy="2790825"/>
+                    </a:xfrm>
+                    <a:prstGeom prst="rect">
+                      <a:avLst/>
+                    </a:prstGeom>
+                  </pic:spPr>
+                </pic:pic>
+              </a:graphicData>
+            </a:graphic>
+          </wp:inline>
+        </w:drawing>
+      </w:r>
+    </w:p>
+    <w:p>
+      <w:pPr>
+        <w:spacing w:after="120" w:before="0"/>
+        <w:jc w:val="center"/>
+      </w:pPr>
+      <w:r>
+        <w:rPr>
+          <w:rFonts w:ascii="Arial" w:cs="Arial" w:eastAsia="Arial" w:hAnsi="Arial"/>
+          <w:i/>
+          <w:iCs/>
+          <w:color w:val="666666"/>
+          <w:sz w:val="17"/>
+          <w:szCs w:val="17"/>
+        </w:rPr>
+        <w:t xml:space="preserve">Figure 5 — pgAdmin 4: DELETE FROM account WHERE account_no=5 blocked — CHECKING balance $3,100.00 (SQL state: 23000)</w:t>
+      </w:r>
+    </w:p>
+    <w:p>
+      <w:pPr>
+        <w:spacing w:after="80" w:before="80"/>
+      </w:pPr>
+    </w:p>
+    <w:p>
+      <w:pPr>
+        <w:pStyle w:val="Heading4"/>
+        <w:spacing w:after="40" w:before="160"/>
+      </w:pPr>
+      <w:r>
+        <w:rPr>
+          <w:rFonts w:ascii="Arial" w:cs="Arial" w:eastAsia="Arial" w:hAnsi="Arial"/>
+          <w:b/>
+          <w:bCs/>
+          <w:color w:val="1F3864"/>
+          <w:sz w:val="20"/>
+          <w:szCs w:val="20"/>
+        </w:rPr>
+        <w:t xml:space="preserve">Figure 6 — Attempt to delete Loan Account #7 ($25,000.00 balance)</w:t>
+      </w:r>
+    </w:p>
+    <w:p>
+      <w:pPr>
+        <w:spacing w:after="80" w:before="60"/>
+      </w:pPr>
+      <w:r>
+        <w:rPr>
+          <w:rFonts w:ascii="Arial" w:cs="Arial" w:eastAsia="Arial" w:hAnsi="Arial"/>
+          <w:color w:val="000000"/>
+          <w:sz w:val="20"/>
+          <w:szCs w:val="20"/>
+        </w:rPr>
+        <w:t xml:space="preserve">DELETE FROM loan_account WHERE account_no = 7 is blocked by trg_prevent_loan_deletion on the Loan_Account subtype table. The trigger function prevent_subtype_deletion_with_balance() looks up the balance from the Account supertype and raises the exception before the row is removed.</w:t>
+      </w:r>
+    </w:p>
+    <w:p>
+      <w:pPr>
+        <w:spacing w:after="80" w:before="80"/>
+      </w:pPr>
+    </w:p>
+    <w:p>
+      <w:pPr>
+        <w:spacing w:after="40" w:before="80"/>
+        <w:jc w:val="center"/>
+      </w:pPr>
+      <w:r>
+        <w:drawing>
+          <wp:inline distT="0" distB="0" distL="0" distR="0">
+            <wp:extent cx="5619750" cy="2790825"/>
+            <wp:effectExtent t="0" r="0" b="0" l="0"/>
+            <wp:docPr id="1" name="" descr="" title=""/>
+            <wp:cNvGraphicFramePr>
+              <a:graphicFrameLocks xmlns:a="http://schemas.openxmlformats.org/drawingml/2006/main" noChangeAspect="1"/>
+            </wp:cNvGraphicFramePr>
+            <a:graphic xmlns:a="http://schemas.openxmlformats.org/drawingml/2006/main">
+              <a:graphicData uri="http://schemas.openxmlformats.org/drawingml/2006/picture">
+                <pic:pic xmlns:pic="http://schemas.openxmlformats.org/drawingml/2006/picture">
+                  <pic:nvPicPr>
+                    <pic:cNvPr id="0" name="" descr=""/>
+                    <pic:cNvPicPr>
+                      <a:picLocks noChangeAspect="1" noChangeArrowheads="1"/>
+                    </pic:cNvPicPr>
+                  </pic:nvPicPr>
+                  <pic:blipFill>
+                    <a:blip r:embed="rId14" cstate="none"/>
+                    <a:srcRect/>
+                    <a:stretch>
+                      <a:fillRect/>
+                    </a:stretch>
+                  </pic:blipFill>
+                  <pic:spPr bwMode="auto">
+                    <a:xfrm>
+                      <a:off x="0" y="0"/>
+                      <a:ext cx="5619750" cy="2790825"/>
+                    </a:xfrm>
+                    <a:prstGeom prst="rect">
+                      <a:avLst/>
+                    </a:prstGeom>
+                  </pic:spPr>
+                </pic:pic>
+              </a:graphicData>
+            </a:graphic>
+          </wp:inline>
+        </w:drawing>
+      </w:r>
+    </w:p>
+    <w:p>
+      <w:pPr>
+        <w:spacing w:after="120" w:before="0"/>
+        <w:jc w:val="center"/>
+      </w:pPr>
+      <w:r>
+        <w:rPr>
+          <w:rFonts w:ascii="Arial" w:cs="Arial" w:eastAsia="Arial" w:hAnsi="Arial"/>
+          <w:i/>
+          <w:iCs/>
+          <w:color w:val="666666"/>
+          <w:sz w:val="17"/>
+          <w:szCs w:val="17"/>
+        </w:rPr>
+        <w:t xml:space="preserve">Figure 6 — pgAdmin 4: DELETE FROM loan_account WHERE account_no=7 blocked — LOAN balance $25,000.00 (SQL state: 23000)</w:t>
+      </w:r>
+    </w:p>
+    <w:p>
+      <w:pPr>
+        <w:spacing w:after="80" w:before="80"/>
+      </w:pPr>
+    </w:p>
+    <w:p>
+      <w:pPr>
+        <w:pStyle w:val="Heading4"/>
+        <w:spacing w:after="40" w:before="160"/>
+      </w:pPr>
+      <w:r>
+        <w:rPr>
+          <w:rFonts w:ascii="Arial" w:cs="Arial" w:eastAsia="Arial" w:hAnsi="Arial"/>
+          <w:b/>
+          <w:bCs/>
+          <w:color w:val="1F3864"/>
+          <w:sz w:val="20"/>
+          <w:szCs w:val="20"/>
+        </w:rPr>
+        <w:t xml:space="preserve">Figure 7 — Attempt to delete Customer Rachel Silver (Money Market Account #6, $41,000.00)</w:t>
+      </w:r>
+    </w:p>
+    <w:p>
+      <w:pPr>
+        <w:spacing w:after="80" w:before="60"/>
+      </w:pPr>
+      <w:r>
+        <w:rPr>
+          <w:rFonts w:ascii="Arial" w:cs="Arial" w:eastAsia="Arial" w:hAnsi="Arial"/>
+          <w:color w:val="000000"/>
+          <w:sz w:val="20"/>
+          <w:szCs w:val="20"/>
+        </w:rPr>
+        <w:t xml:space="preserve">DELETE FROM customer WHERE ssn = '505-05-0005' is blocked by trg_prevent_customer_deletion. The trigger loops through all accounts linked to this customer and raises an exception naming the specific account (MONEY_MARKET #6) and its balance ($41,000.00), preventing the customer record from being removed while funds remain.</w:t>
+      </w:r>
+    </w:p>
+    <w:p>
+      <w:pPr>
+        <w:spacing w:after="80" w:before="80"/>
+      </w:pPr>
+    </w:p>
+    <w:p>
+      <w:pPr>
+        <w:spacing w:after="40" w:before="80"/>
+        <w:jc w:val="center"/>
+      </w:pPr>
+      <w:r>
+        <w:drawing>
+          <wp:inline distT="0" distB="0" distL="0" distR="0">
+            <wp:extent cx="5619750" cy="2790825"/>
+            <wp:effectExtent t="0" r="0" b="0" l="0"/>
+            <wp:docPr id="1" name="" descr="" title=""/>
+            <wp:cNvGraphicFramePr>
+              <a:graphicFrameLocks xmlns:a="http://schemas.openxmlformats.org/drawingml/2006/main" noChangeAspect="1"/>
+            </wp:cNvGraphicFramePr>
+            <a:graphic xmlns:a="http://schemas.openxmlformats.org/drawingml/2006/main">
+              <a:graphicData uri="http://schemas.openxmlformats.org/drawingml/2006/picture">
+                <pic:pic xmlns:pic="http://schemas.openxmlformats.org/drawingml/2006/picture">
+                  <pic:nvPicPr>
+                    <pic:cNvPr id="0" name="" descr=""/>
+                    <pic:cNvPicPr>
+                      <a:picLocks noChangeAspect="1" noChangeArrowheads="1"/>
+                    </pic:cNvPicPr>
+                  </pic:nvPicPr>
+                  <pic:blipFill>
+                    <a:blip r:embed="rId15" cstate="none"/>
+                    <a:srcRect/>
+                    <a:stretch>
+                      <a:fillRect/>
+                    </a:stretch>
+                  </pic:blipFill>
+                  <pic:spPr bwMode="auto">
+                    <a:xfrm>
+                      <a:off x="0" y="0"/>
+                      <a:ext cx="5619750" cy="2790825"/>
+                    </a:xfrm>
+                    <a:prstGeom prst="rect">
+                      <a:avLst/>
+                    </a:prstGeom>
+                  </pic:spPr>
+                </pic:pic>
+              </a:graphicData>
+            </a:graphic>
+          </wp:inline>
+        </w:drawing>
+      </w:r>
+    </w:p>
+    <w:p>
+      <w:pPr>
+        <w:spacing w:after="120" w:before="0"/>
+        <w:jc w:val="center"/>
+      </w:pPr>
+      <w:r>
+        <w:rPr>
+          <w:rFonts w:ascii="Arial" w:cs="Arial" w:eastAsia="Arial" w:hAnsi="Arial"/>
+          <w:i/>
+          <w:iCs/>
+          <w:color w:val="666666"/>
+          <w:sz w:val="17"/>
+          <w:szCs w:val="17"/>
+        </w:rPr>
+        <w:t xml:space="preserve">Figure 7 — pgAdmin 4: DELETE FROM customer WHERE ssn='505-05-0005' blocked — MONEY_MARKET Account #6 balance $41,000.00 (SQL state: 23000)</w:t>
       </w:r>
     </w:p>
     <w:p>

</xml_diff>